<commit_message>
feat: add document export functionality for notulensi - implement download feature in NotulensiInputForm and integrate with template - update UI components for download state management
</commit_message>
<xml_diff>
--- a/public/2. Template Notulensi Rakordir.docx
+++ b/public/2. Template Notulensi Rakordir.docx
@@ -48,31 +48,67 @@
         <w:rPr>
           <w:b w:val="0"/>
         </w:rPr>
-        <w:t>{xx}</w:t>
+        <w:t>{</w:t>
       </w:r>
       <w:r>
         <w:rPr>
           <w:b w:val="0"/>
         </w:rPr>
+        <w:t>TANGGAL_RAPAT</w:t>
+      </w:r>
+      <w:r>
+        <w:rPr>
+          <w:b w:val="0"/>
+        </w:rPr>
+        <w:t>}</w:t>
+      </w:r>
+      <w:r>
+        <w:rPr>
+          <w:b w:val="0"/>
+        </w:rPr>
         <w:t xml:space="preserve"> pukul </w:t>
       </w:r>
       <w:r>
         <w:rPr>
           <w:b w:val="0"/>
         </w:rPr>
-        <w:t>{startTime}</w:t>
+        <w:t>{</w:t>
       </w:r>
       <w:r>
         <w:rPr>
           <w:b w:val="0"/>
         </w:rPr>
+        <w:t>WAKTU_MULAI</w:t>
+      </w:r>
+      <w:r>
+        <w:rPr>
+          <w:b w:val="0"/>
+        </w:rPr>
+        <w:t>}</w:t>
+      </w:r>
+      <w:r>
+        <w:rPr>
+          <w:b w:val="0"/>
+        </w:rPr>
         <w:t xml:space="preserve"> s.d </w:t>
       </w:r>
       <w:r>
         <w:rPr>
           <w:b w:val="0"/>
         </w:rPr>
-        <w:t>{endTime}</w:t>
+        <w:t>{</w:t>
+      </w:r>
+      <w:r>
+        <w:rPr>
+          <w:b w:val="0"/>
+        </w:rPr>
+        <w:t>WAKTU_SELESAI</w:t>
+      </w:r>
+      <w:r>
+        <w:rPr>
+          <w:b w:val="0"/>
+        </w:rPr>
+        <w:t>}</w:t>
       </w:r>
       <w:r>
         <w:rPr>
@@ -98,7 +134,23 @@
           <w:bCs w:val="0"/>
           <w:spacing w:val="35"/>
         </w:rPr>
-        <w:t>{meetingLocation}</w:t>
+        <w:t>{</w:t>
+      </w:r>
+      <w:r>
+        <w:rPr>
+          <w:b w:val="0"/>
+          <w:bCs w:val="0"/>
+          <w:spacing w:val="35"/>
+        </w:rPr>
+        <w:t>LOKASI_RAPAT</w:t>
+      </w:r>
+      <w:r>
+        <w:rPr>
+          <w:b w:val="0"/>
+          <w:bCs w:val="0"/>
+          <w:spacing w:val="35"/>
+        </w:rPr>
+        <w:t>}</w:t>
       </w:r>
       <w:r>
         <w:rPr>
@@ -267,7 +319,19 @@
         <w:rPr>
           <w:b w:val="0"/>
         </w:rPr>
-        <w:t>{guestParticipants}</w:t>
+        <w:t>{</w:t>
+      </w:r>
+      <w:r>
+        <w:rPr>
+          <w:b w:val="0"/>
+        </w:rPr>
+        <w:t>TAMU_UNDANGAN</w:t>
+      </w:r>
+      <w:r>
+        <w:rPr>
+          <w:b w:val="0"/>
+        </w:rPr>
+        <w:t>}</w:t>
       </w:r>
       <w:r>
         <w:rPr>
@@ -1105,7 +1169,13 @@
       <w:t xml:space="preserve"> </w:t>
     </w:r>
     <w:r>
-      <w:t>{xx}</w:t>
+      <w:t>{</w:t>
+    </w:r>
+    <w:r>
+      <w:t>HARI_TANGGAL</w:t>
+    </w:r>
+    <w:r>
+      <w:t>}</w:t>
     </w:r>
   </w:p>
   <w:p>
@@ -1136,7 +1206,19 @@
       <w:rPr>
         <w:spacing w:val="35"/>
       </w:rPr>
-      <w:t>{meetingLocation}</w:t>
+      <w:t>{</w:t>
+    </w:r>
+    <w:r>
+      <w:rPr>
+        <w:spacing w:val="35"/>
+      </w:rPr>
+      <w:t>TEMPAT</w:t>
+    </w:r>
+    <w:r>
+      <w:rPr>
+        <w:spacing w:val="35"/>
+      </w:rPr>
+      <w:t>}</w:t>
     </w:r>
   </w:p>
   <w:p>
@@ -1205,7 +1287,7 @@
         </mc:Choice>
         <mc:Fallback>
           <w:pict>
-            <v:line w14:anchorId="637DD994" id="Straight Connector 6" o:spid="_x0000_s1026" style="position:absolute;z-index:251657728;visibility:visible;mso-wrap-style:square;mso-wrap-distance-left:9pt;mso-wrap-distance-top:0;mso-wrap-distance-right:9pt;mso-wrap-distance-bottom:0;mso-position-horizontal:absolute;mso-position-horizontal-relative:text;mso-position-vertical:absolute;mso-position-vertical-relative:text" from="5.3pt,17.2pt" to="477.35pt,17.2pt" o:gfxdata="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" strokecolor="black [3213]" strokeweight="1pt"/>
+            <v:line w14:anchorId="050665B0" id="Straight Connector 6" o:spid="_x0000_s1026" style="position:absolute;z-index:251657728;visibility:visible;mso-wrap-style:square;mso-wrap-distance-left:9pt;mso-wrap-distance-top:0;mso-wrap-distance-right:9pt;mso-wrap-distance-bottom:0;mso-position-horizontal:absolute;mso-position-horizontal-relative:text;mso-position-vertical:absolute;mso-position-vertical-relative:text" from="5.3pt,17.2pt" to="477.35pt,17.2pt" o:gfxdata="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" strokecolor="black [3213]" strokeweight="1pt"/>
           </w:pict>
         </mc:Fallback>
       </mc:AlternateContent>
@@ -6283,6 +6365,7 @@
   <w:style w:type="character" w:default="1" w:styleId="DefaultParagraphFont">
     <w:name w:val="Default Paragraph Font"/>
     <w:uiPriority w:val="1"/>
+    <w:semiHidden/>
     <w:unhideWhenUsed/>
   </w:style>
   <w:style w:type="table" w:default="1" w:styleId="TableNormal">
@@ -6830,6 +6913,10 @@
 </file>
 
 <file path=customXml/item1.xml><?xml version="1.0" encoding="utf-8"?>
+<b:Sources xmlns:b="http://schemas.openxmlformats.org/officeDocument/2006/bibliography" xmlns="http://schemas.openxmlformats.org/officeDocument/2006/bibliography" SelectedStyle="\APA.XSL" StyleName="APA"/>
+</file>
+
+<file path=customXml/item2.xml><?xml version="1.0" encoding="utf-8"?>
 <s:customData xmlns="http://www.wps.cn/officeDocument/2013/wpsCustomData" xmlns:s="http://www.wps.cn/officeDocument/2013/wpsCustomData">
   <customSectProps>
     <customSectPr/>
@@ -6841,22 +6928,18 @@
 </s:customData>
 </file>
 
-<file path=customXml/item2.xml><?xml version="1.0" encoding="utf-8"?>
-<b:Sources xmlns:b="http://schemas.openxmlformats.org/officeDocument/2006/bibliography" xmlns="http://schemas.openxmlformats.org/officeDocument/2006/bibliography" SelectedStyle="\APA.XSL" StyleName="APA"/>
+<file path=customXml/itemProps1.xml><?xml version="1.0" encoding="utf-8"?>
+<ds:datastoreItem xmlns:ds="http://schemas.openxmlformats.org/officeDocument/2006/customXml" ds:itemID="{A94C8070-DD1B-43F5-9043-6C48B673B62A}">
+  <ds:schemaRefs>
+    <ds:schemaRef ds:uri="http://schemas.openxmlformats.org/officeDocument/2006/bibliography"/>
+  </ds:schemaRefs>
+</ds:datastoreItem>
 </file>
 
-<file path=customXml/itemProps1.xml><?xml version="1.0" encoding="utf-8"?>
+<file path=customXml/itemProps2.xml><?xml version="1.0" encoding="utf-8"?>
 <ds:datastoreItem xmlns:ds="http://schemas.openxmlformats.org/officeDocument/2006/customXml" ds:itemID="{B1977F7D-205B-4081-913C-38D41E755F92}">
   <ds:schemaRefs>
     <ds:schemaRef ds:uri="http://www.wps.cn/officeDocument/2013/wpsCustomData"/>
   </ds:schemaRefs>
 </ds:datastoreItem>
-</file>
-
-<file path=customXml/itemProps2.xml><?xml version="1.0" encoding="utf-8"?>
-<ds:datastoreItem xmlns:ds="http://schemas.openxmlformats.org/officeDocument/2006/customXml" ds:itemID="{A94C8070-DD1B-43F5-9043-6C48B673B62A}">
-  <ds:schemaRefs>
-    <ds:schemaRef ds:uri="http://schemas.openxmlformats.org/officeDocument/2006/bibliography"/>
-  </ds:schemaRefs>
-</ds:datastoreItem>
 </file>
</xml_diff>